<commit_message>
docs: atualiza entrega da atividade 06
</commit_message>
<xml_diff>
--- a/backend/docs/Ficha_Padrao_Entrega_Atividade_06_Esboco.docx
+++ b/backend/docs/Ficha_Padrao_Entrega_Atividade_06_Esboco.docx
@@ -23,12 +23,14 @@
       <w:pPr>
         <w:rPr>
           <w:rFonts w:ascii="Arial" w:hAnsi="Arial" w:cs="Arial"/>
-          <w:sz w:val="22"/>
-        </w:rPr>
-      </w:pPr>
-      <w:r>
-        <w:rPr>
-          <w:rFonts w:ascii="Arial" w:hAnsi="Arial" w:cs="Arial"/>
+          <w:b/>
+          <w:sz w:val="22"/>
+        </w:rPr>
+      </w:pPr>
+      <w:r>
+        <w:rPr>
+          <w:rFonts w:ascii="Arial" w:hAnsi="Arial" w:cs="Arial"/>
+          <w:b/>
           <w:sz w:val="22"/>
         </w:rPr>
         <w:t>Fundamentos de Programação Orientada a Objetos · ADS · ULBRA · 2026/2</w:t>
@@ -38,20 +40,23 @@
       <w:pPr>
         <w:rPr>
           <w:rFonts w:ascii="Arial" w:hAnsi="Arial" w:cs="Arial"/>
-          <w:sz w:val="22"/>
-        </w:rPr>
-      </w:pPr>
-    </w:p>
-    <w:p>
-      <w:pPr>
-        <w:rPr>
-          <w:rFonts w:ascii="Arial" w:hAnsi="Arial" w:cs="Arial"/>
-          <w:sz w:val="22"/>
-        </w:rPr>
-      </w:pPr>
-      <w:r>
-        <w:rPr>
-          <w:rFonts w:ascii="Arial" w:hAnsi="Arial" w:cs="Arial"/>
+          <w:b/>
+          <w:sz w:val="22"/>
+        </w:rPr>
+      </w:pPr>
+    </w:p>
+    <w:p>
+      <w:pPr>
+        <w:rPr>
+          <w:rFonts w:ascii="Arial" w:hAnsi="Arial" w:cs="Arial"/>
+          <w:b/>
+          <w:sz w:val="22"/>
+        </w:rPr>
+      </w:pPr>
+      <w:r>
+        <w:rPr>
+          <w:rFonts w:ascii="Arial" w:hAnsi="Arial" w:cs="Arial"/>
+          <w:b/>
           <w:sz w:val="22"/>
         </w:rPr>
         <w:t>1. IDENTIFICAÇÃO</w:t>
@@ -61,12 +66,14 @@
       <w:pPr>
         <w:rPr>
           <w:rFonts w:ascii="Arial" w:hAnsi="Arial" w:cs="Arial"/>
-          <w:sz w:val="22"/>
-        </w:rPr>
-      </w:pPr>
-      <w:r>
-        <w:rPr>
-          <w:rFonts w:ascii="Arial" w:hAnsi="Arial" w:cs="Arial"/>
+          <w:b/>
+          <w:sz w:val="22"/>
+        </w:rPr>
+      </w:pPr>
+      <w:r>
+        <w:rPr>
+          <w:rFonts w:ascii="Arial" w:hAnsi="Arial" w:cs="Arial"/>
+          <w:b/>
           <w:sz w:val="22"/>
         </w:rPr>
         <w:t>Nome do projeto: TechFix — Sistema de Assistência Técnica</w:t>
@@ -76,12 +83,14 @@
       <w:pPr>
         <w:rPr>
           <w:rFonts w:ascii="Arial" w:hAnsi="Arial" w:cs="Arial"/>
-          <w:sz w:val="22"/>
-        </w:rPr>
-      </w:pPr>
-      <w:r>
-        <w:rPr>
-          <w:rFonts w:ascii="Arial" w:hAnsi="Arial" w:cs="Arial"/>
+          <w:b/>
+          <w:sz w:val="22"/>
+        </w:rPr>
+      </w:pPr>
+      <w:r>
+        <w:rPr>
+          <w:rFonts w:ascii="Arial" w:hAnsi="Arial" w:cs="Arial"/>
+          <w:b/>
           <w:sz w:val="22"/>
         </w:rPr>
         <w:t>Integrantes: Arthur Scharfenberger e Lucas Oliveira da Silva</w:t>
@@ -91,12 +100,14 @@
       <w:pPr>
         <w:rPr>
           <w:rFonts w:ascii="Arial" w:hAnsi="Arial" w:cs="Arial"/>
-          <w:sz w:val="22"/>
-        </w:rPr>
-      </w:pPr>
-      <w:r>
-        <w:rPr>
-          <w:rFonts w:ascii="Arial" w:hAnsi="Arial" w:cs="Arial"/>
+          <w:b/>
+          <w:sz w:val="22"/>
+        </w:rPr>
+      </w:pPr>
+      <w:r>
+        <w:rPr>
+          <w:rFonts w:ascii="Arial" w:hAnsi="Arial" w:cs="Arial"/>
+          <w:b/>
           <w:sz w:val="22"/>
         </w:rPr>
         <w:t>Encontro nº: 6</w:t>
@@ -106,12 +117,14 @@
       <w:pPr>
         <w:rPr>
           <w:rFonts w:ascii="Arial" w:hAnsi="Arial" w:cs="Arial"/>
-          <w:sz w:val="22"/>
-        </w:rPr>
-      </w:pPr>
-      <w:r>
-        <w:rPr>
-          <w:rFonts w:ascii="Arial" w:hAnsi="Arial" w:cs="Arial"/>
+          <w:b/>
+          <w:sz w:val="22"/>
+        </w:rPr>
+      </w:pPr>
+      <w:r>
+        <w:rPr>
+          <w:rFonts w:ascii="Arial" w:hAnsi="Arial" w:cs="Arial"/>
+          <w:b/>
           <w:sz w:val="22"/>
         </w:rPr>
         <w:t>Data do envio: 31/08/2026</w:t>
@@ -121,20 +134,23 @@
       <w:pPr>
         <w:rPr>
           <w:rFonts w:ascii="Arial" w:hAnsi="Arial" w:cs="Arial"/>
-          <w:sz w:val="22"/>
-        </w:rPr>
-      </w:pPr>
-    </w:p>
-    <w:p>
-      <w:pPr>
-        <w:rPr>
-          <w:rFonts w:ascii="Arial" w:hAnsi="Arial" w:cs="Arial"/>
-          <w:sz w:val="22"/>
-        </w:rPr>
-      </w:pPr>
-      <w:r>
-        <w:rPr>
-          <w:rFonts w:ascii="Arial" w:hAnsi="Arial" w:cs="Arial"/>
+          <w:b/>
+          <w:sz w:val="22"/>
+        </w:rPr>
+      </w:pPr>
+    </w:p>
+    <w:p>
+      <w:pPr>
+        <w:rPr>
+          <w:rFonts w:ascii="Arial" w:hAnsi="Arial" w:cs="Arial"/>
+          <w:b/>
+          <w:sz w:val="22"/>
+        </w:rPr>
+      </w:pPr>
+      <w:r>
+        <w:rPr>
+          <w:rFonts w:ascii="Arial" w:hAnsi="Arial" w:cs="Arial"/>
+          <w:b/>
           <w:sz w:val="22"/>
         </w:rPr>
         <w:t>2. ETAPA DESTA ENTREGA</w:t>
@@ -144,12 +160,14 @@
       <w:pPr>
         <w:rPr>
           <w:rFonts w:ascii="Arial" w:hAnsi="Arial" w:cs="Arial"/>
-          <w:sz w:val="22"/>
-        </w:rPr>
-      </w:pPr>
-      <w:r>
-        <w:rPr>
-          <w:rFonts w:ascii="Arial" w:hAnsi="Arial" w:cs="Arial"/>
+          <w:b/>
+          <w:sz w:val="22"/>
+        </w:rPr>
+      </w:pPr>
+      <w:r>
+        <w:rPr>
+          <w:rFonts w:ascii="Arial" w:hAnsi="Arial" w:cs="Arial"/>
+          <w:b/>
           <w:sz w:val="22"/>
         </w:rPr>
         <w:t>[X] Atividade semanal     [ ] AP1     [ ] AP2     [ ] AS</w:t>
@@ -159,12 +177,14 @@
       <w:pPr>
         <w:rPr>
           <w:rFonts w:ascii="Arial" w:hAnsi="Arial" w:cs="Arial"/>
-          <w:sz w:val="22"/>
-        </w:rPr>
-      </w:pPr>
-      <w:r>
-        <w:rPr>
-          <w:rFonts w:ascii="Arial" w:hAnsi="Arial" w:cs="Arial"/>
+          <w:b/>
+          <w:sz w:val="22"/>
+        </w:rPr>
+      </w:pPr>
+      <w:r>
+        <w:rPr>
+          <w:rFonts w:ascii="Arial" w:hAnsi="Arial" w:cs="Arial"/>
+          <w:b/>
           <w:sz w:val="22"/>
         </w:rPr>
         <w:t>Número da atividade semanal: 6</w:t>
@@ -174,12 +194,14 @@
       <w:pPr>
         <w:rPr>
           <w:rFonts w:ascii="Arial" w:hAnsi="Arial" w:cs="Arial"/>
-          <w:sz w:val="22"/>
-        </w:rPr>
-      </w:pPr>
-      <w:r>
-        <w:rPr>
-          <w:rFonts w:ascii="Arial" w:hAnsi="Arial" w:cs="Arial"/>
+          <w:b/>
+          <w:sz w:val="22"/>
+        </w:rPr>
+      </w:pPr>
+      <w:r>
+        <w:rPr>
+          <w:rFonts w:ascii="Arial" w:hAnsi="Arial" w:cs="Arial"/>
+          <w:b/>
           <w:sz w:val="22"/>
         </w:rPr>
         <w:t>[X] Esboço     [ ] Entrega final</w:t>
@@ -189,20 +211,23 @@
       <w:pPr>
         <w:rPr>
           <w:rFonts w:ascii="Arial" w:hAnsi="Arial" w:cs="Arial"/>
-          <w:sz w:val="22"/>
-        </w:rPr>
-      </w:pPr>
-    </w:p>
-    <w:p>
-      <w:pPr>
-        <w:rPr>
-          <w:rFonts w:ascii="Arial" w:hAnsi="Arial" w:cs="Arial"/>
-          <w:sz w:val="22"/>
-        </w:rPr>
-      </w:pPr>
-      <w:r>
-        <w:rPr>
-          <w:rFonts w:ascii="Arial" w:hAnsi="Arial" w:cs="Arial"/>
+          <w:b/>
+          <w:sz w:val="22"/>
+        </w:rPr>
+      </w:pPr>
+    </w:p>
+    <w:p>
+      <w:pPr>
+        <w:rPr>
+          <w:rFonts w:ascii="Arial" w:hAnsi="Arial" w:cs="Arial"/>
+          <w:b/>
+          <w:sz w:val="22"/>
+        </w:rPr>
+      </w:pPr>
+      <w:r>
+        <w:rPr>
+          <w:rFonts w:ascii="Arial" w:hAnsi="Arial" w:cs="Arial"/>
+          <w:b/>
           <w:sz w:val="22"/>
         </w:rPr>
         <w:t>3. LINKS</w:t>
@@ -212,12 +237,14 @@
       <w:pPr>
         <w:rPr>
           <w:rFonts w:ascii="Arial" w:hAnsi="Arial" w:cs="Arial"/>
-          <w:sz w:val="22"/>
-        </w:rPr>
-      </w:pPr>
-      <w:r>
-        <w:rPr>
-          <w:rFonts w:ascii="Arial" w:hAnsi="Arial" w:cs="Arial"/>
+          <w:b/>
+          <w:sz w:val="22"/>
+        </w:rPr>
+      </w:pPr>
+      <w:r>
+        <w:rPr>
+          <w:rFonts w:ascii="Arial" w:hAnsi="Arial" w:cs="Arial"/>
+          <w:b/>
           <w:sz w:val="22"/>
         </w:rPr>
         <w:t>Repositório GitHub: https://github.com/ArthurScharfenberger/TechFix-Assistencia-Tecnica</w:t>
@@ -227,27 +254,31 @@
       <w:pPr>
         <w:rPr>
           <w:rFonts w:ascii="Arial" w:hAnsi="Arial" w:cs="Arial"/>
-          <w:sz w:val="22"/>
-        </w:rPr>
-      </w:pPr>
-      <w:r>
-        <w:rPr>
-          <w:rFonts w:ascii="Arial" w:hAnsi="Arial" w:cs="Arial"/>
-          <w:sz w:val="22"/>
-        </w:rPr>
-        <w:t>Commit do código: https://github.com/ArthurScharfenberger/TechFix-Assistencia-Tecnica/commit/439281e</w:t>
-      </w:r>
-    </w:p>
-    <w:p>
-      <w:pPr>
-        <w:rPr>
-          <w:rFonts w:ascii="Arial" w:hAnsi="Arial" w:cs="Arial"/>
-          <w:sz w:val="22"/>
-        </w:rPr>
-      </w:pPr>
-      <w:r>
-        <w:rPr>
-          <w:rFonts w:ascii="Arial" w:hAnsi="Arial" w:cs="Arial"/>
+          <w:b/>
+          <w:sz w:val="22"/>
+        </w:rPr>
+      </w:pPr>
+      <w:r>
+        <w:rPr>
+          <w:rFonts w:ascii="Arial" w:hAnsi="Arial" w:cs="Arial"/>
+          <w:b/>
+          <w:sz w:val="22"/>
+        </w:rPr>
+        <w:t>Commit atualizado do código: https://github.com/ArthurScharfenberger/TechFix-Assistencia-Tecnica/commit/ff608fb</w:t>
+      </w:r>
+    </w:p>
+    <w:p>
+      <w:pPr>
+        <w:rPr>
+          <w:rFonts w:ascii="Arial" w:hAnsi="Arial" w:cs="Arial"/>
+          <w:b/>
+          <w:sz w:val="22"/>
+        </w:rPr>
+      </w:pPr>
+      <w:r>
+        <w:rPr>
+          <w:rFonts w:ascii="Arial" w:hAnsi="Arial" w:cs="Arial"/>
+          <w:b/>
           <w:sz w:val="22"/>
         </w:rPr>
         <w:t>Tag / release: Não se aplica.</w:t>
@@ -257,12 +288,14 @@
       <w:pPr>
         <w:rPr>
           <w:rFonts w:ascii="Arial" w:hAnsi="Arial" w:cs="Arial"/>
-          <w:sz w:val="22"/>
-        </w:rPr>
-      </w:pPr>
-      <w:r>
-        <w:rPr>
-          <w:rFonts w:ascii="Arial" w:hAnsi="Arial" w:cs="Arial"/>
+          <w:b/>
+          <w:sz w:val="22"/>
+        </w:rPr>
+      </w:pPr>
+      <w:r>
+        <w:rPr>
+          <w:rFonts w:ascii="Arial" w:hAnsi="Arial" w:cs="Arial"/>
+          <w:b/>
           <w:sz w:val="22"/>
         </w:rPr>
         <w:t>Link dos slides: Não se aplica.</w:t>
@@ -272,35 +305,40 @@
       <w:pPr>
         <w:rPr>
           <w:rFonts w:ascii="Arial" w:hAnsi="Arial" w:cs="Arial"/>
-          <w:sz w:val="22"/>
-        </w:rPr>
-      </w:pPr>
-      <w:r>
-        <w:rPr>
-          <w:rFonts w:ascii="Arial" w:hAnsi="Arial" w:cs="Arial"/>
-          <w:sz w:val="22"/>
-        </w:rPr>
-        <w:t>Outros links: Não se aplica.</w:t>
-      </w:r>
-    </w:p>
-    <w:p>
-      <w:pPr>
-        <w:rPr>
-          <w:rFonts w:ascii="Arial" w:hAnsi="Arial" w:cs="Arial"/>
-          <w:sz w:val="22"/>
-        </w:rPr>
-      </w:pPr>
-    </w:p>
-    <w:p>
-      <w:pPr>
-        <w:rPr>
-          <w:rFonts w:ascii="Arial" w:hAnsi="Arial" w:cs="Arial"/>
-          <w:sz w:val="22"/>
-        </w:rPr>
-      </w:pPr>
-      <w:r>
-        <w:rPr>
-          <w:rFonts w:ascii="Arial" w:hAnsi="Arial" w:cs="Arial"/>
+          <w:b/>
+          <w:sz w:val="22"/>
+        </w:rPr>
+      </w:pPr>
+      <w:r>
+        <w:rPr>
+          <w:rFonts w:ascii="Arial" w:hAnsi="Arial" w:cs="Arial"/>
+          <w:b/>
+          <w:sz w:val="22"/>
+        </w:rPr>
+        <w:t>Outros links: Diagrama de classes no diretório Diagrama-Classes do repositório.</w:t>
+      </w:r>
+    </w:p>
+    <w:p>
+      <w:pPr>
+        <w:rPr>
+          <w:rFonts w:ascii="Arial" w:hAnsi="Arial" w:cs="Arial"/>
+          <w:b/>
+          <w:sz w:val="22"/>
+        </w:rPr>
+      </w:pPr>
+    </w:p>
+    <w:p>
+      <w:pPr>
+        <w:rPr>
+          <w:rFonts w:ascii="Arial" w:hAnsi="Arial" w:cs="Arial"/>
+          <w:b/>
+          <w:sz w:val="22"/>
+        </w:rPr>
+      </w:pPr>
+      <w:r>
+        <w:rPr>
+          <w:rFonts w:ascii="Arial" w:hAnsi="Arial" w:cs="Arial"/>
+          <w:b/>
           <w:sz w:val="22"/>
         </w:rPr>
         <w:t>4. DECLARAÇÃO DE USO DE IA</w:t>
@@ -310,12 +348,14 @@
       <w:pPr>
         <w:rPr>
           <w:rFonts w:ascii="Arial" w:hAnsi="Arial" w:cs="Arial"/>
-          <w:sz w:val="22"/>
-        </w:rPr>
-      </w:pPr>
-      <w:r>
-        <w:rPr>
-          <w:rFonts w:ascii="Arial" w:hAnsi="Arial" w:cs="Arial"/>
+          <w:b/>
+          <w:sz w:val="22"/>
+        </w:rPr>
+      </w:pPr>
+      <w:r>
+        <w:rPr>
+          <w:rFonts w:ascii="Arial" w:hAnsi="Arial" w:cs="Arial"/>
+          <w:b/>
           <w:sz w:val="22"/>
         </w:rPr>
         <w:t>[X] Sim, usei IA nesta entrega     [ ] Não usei IA nesta entrega</w:t>
@@ -325,12 +365,14 @@
       <w:pPr>
         <w:rPr>
           <w:rFonts w:ascii="Arial" w:hAnsi="Arial" w:cs="Arial"/>
-          <w:sz w:val="22"/>
-        </w:rPr>
-      </w:pPr>
-      <w:r>
-        <w:rPr>
-          <w:rFonts w:ascii="Arial" w:hAnsi="Arial" w:cs="Arial"/>
+          <w:b/>
+          <w:sz w:val="22"/>
+        </w:rPr>
+      </w:pPr>
+      <w:r>
+        <w:rPr>
+          <w:rFonts w:ascii="Arial" w:hAnsi="Arial" w:cs="Arial"/>
+          <w:b/>
           <w:sz w:val="22"/>
         </w:rPr>
         <w:t>Ferramenta utilizada: Codex (OpenAI).</w:t>
@@ -340,50 +382,57 @@
       <w:pPr>
         <w:rPr>
           <w:rFonts w:ascii="Arial" w:hAnsi="Arial" w:cs="Arial"/>
-          <w:sz w:val="22"/>
-        </w:rPr>
-      </w:pPr>
-      <w:r>
-        <w:rPr>
-          <w:rFonts w:ascii="Arial" w:hAnsi="Arial" w:cs="Arial"/>
-          <w:sz w:val="22"/>
-        </w:rPr>
-        <w:t>Partes em que foi usada: apoio na revisão da sintaxe de generics, implementação da coleção e do método de inclusão, execução dos testes e preenchimento desta ficha.</w:t>
-      </w:r>
-    </w:p>
-    <w:p>
-      <w:pPr>
-        <w:rPr>
-          <w:rFonts w:ascii="Arial" w:hAnsi="Arial" w:cs="Arial"/>
-          <w:sz w:val="22"/>
-        </w:rPr>
-      </w:pPr>
-      <w:r>
-        <w:rPr>
-          <w:rFonts w:ascii="Arial" w:hAnsi="Arial" w:cs="Arial"/>
-          <w:sz w:val="22"/>
-        </w:rPr>
-        <w:t>O que foi feito sem apoio de IA: o domínio, as classes e a multiplicidade Cliente 1 para 0..* OrdemServico já haviam sido definidos pela equipe no projeto e no diagrama de classes.</w:t>
-      </w:r>
-    </w:p>
-    <w:p>
-      <w:pPr>
-        <w:rPr>
-          <w:rFonts w:ascii="Arial" w:hAnsi="Arial" w:cs="Arial"/>
-          <w:sz w:val="22"/>
-        </w:rPr>
-      </w:pPr>
-    </w:p>
-    <w:p>
-      <w:pPr>
-        <w:rPr>
-          <w:rFonts w:ascii="Arial" w:hAnsi="Arial" w:cs="Arial"/>
-          <w:sz w:val="22"/>
-        </w:rPr>
-      </w:pPr>
-      <w:r>
-        <w:rPr>
-          <w:rFonts w:ascii="Arial" w:hAnsi="Arial" w:cs="Arial"/>
+          <w:b/>
+          <w:sz w:val="22"/>
+        </w:rPr>
+      </w:pPr>
+      <w:r>
+        <w:rPr>
+          <w:rFonts w:ascii="Arial" w:hAnsi="Arial" w:cs="Arial"/>
+          <w:b/>
+          <w:sz w:val="22"/>
+        </w:rPr>
+        <w:t>Partes em que foi usada: revisão do material da aula, adequação da sintaxe da coleção, implementação da validação de nulo e do teste correspondente, execução dos testes e atualização da documentação e desta ficha.</w:t>
+      </w:r>
+    </w:p>
+    <w:p>
+      <w:pPr>
+        <w:rPr>
+          <w:rFonts w:ascii="Arial" w:hAnsi="Arial" w:cs="Arial"/>
+          <w:b/>
+          <w:sz w:val="22"/>
+        </w:rPr>
+      </w:pPr>
+      <w:r>
+        <w:rPr>
+          <w:rFonts w:ascii="Arial" w:hAnsi="Arial" w:cs="Arial"/>
+          <w:b/>
+          <w:sz w:val="22"/>
+        </w:rPr>
+        <w:t>O que foi feito sem apoio de IA: o domínio, as classes e a multiplicidade Cliente 1 para 0..* OrdemServico já haviam sido definidos pela equipe no projeto e no diagrama de classes. A equipe permanece responsável por compreender e defender a associação e a escolha de List.</w:t>
+      </w:r>
+    </w:p>
+    <w:p>
+      <w:pPr>
+        <w:rPr>
+          <w:rFonts w:ascii="Arial" w:hAnsi="Arial" w:cs="Arial"/>
+          <w:b/>
+          <w:sz w:val="22"/>
+        </w:rPr>
+      </w:pPr>
+    </w:p>
+    <w:p>
+      <w:pPr>
+        <w:rPr>
+          <w:rFonts w:ascii="Arial" w:hAnsi="Arial" w:cs="Arial"/>
+          <w:b/>
+          <w:sz w:val="22"/>
+        </w:rPr>
+      </w:pPr>
+      <w:r>
+        <w:rPr>
+          <w:rFonts w:ascii="Arial" w:hAnsi="Arial" w:cs="Arial"/>
+          <w:b/>
           <w:sz w:val="22"/>
         </w:rPr>
         <w:t>5. BREVE EXPLICAÇÃO DA ENTREGA</w:t>
@@ -393,36 +442,40 @@
       <w:pPr>
         <w:rPr>
           <w:rFonts w:ascii="Arial" w:hAnsi="Arial" w:cs="Arial"/>
-          <w:sz w:val="22"/>
-        </w:rPr>
-      </w:pPr>
-      <w:r>
-        <w:rPr>
-          <w:rFonts w:ascii="Arial" w:hAnsi="Arial" w:cs="Arial"/>
-          <w:sz w:val="22"/>
-        </w:rPr>
-        <w:lastRenderedPageBreak/>
-        <w:t>Um Cliente tem várias OrdemServico, pois o mesmo cliente pode solicitar diferentes atendimentos ao longo do tempo. Foi usada uma List porque as ordens formam uma sequência simples e esta etapa ainda não exige chaves nem controle de duplicidade. A coleção foi inicializada no construtor de Cliente e o método adicionarOrdemServico inclui cada nova ordem.</w:t>
-      </w:r>
-    </w:p>
-    <w:p>
-      <w:pPr>
-        <w:rPr>
-          <w:rFonts w:ascii="Arial" w:hAnsi="Arial" w:cs="Arial"/>
-          <w:sz w:val="22"/>
-        </w:rPr>
-      </w:pPr>
-    </w:p>
-    <w:p>
-      <w:pPr>
-        <w:rPr>
-          <w:rFonts w:ascii="Arial" w:hAnsi="Arial" w:cs="Arial"/>
-          <w:sz w:val="22"/>
-        </w:rPr>
-      </w:pPr>
-      <w:r>
-        <w:rPr>
-          <w:rFonts w:ascii="Arial" w:hAnsi="Arial" w:cs="Arial"/>
+          <w:b/>
+          <w:sz w:val="22"/>
+        </w:rPr>
+      </w:pPr>
+      <w:r>
+        <w:rPr>
+          <w:rFonts w:ascii="Arial" w:hAnsi="Arial" w:cs="Arial"/>
+          <w:b/>
+          <w:sz w:val="22"/>
+        </w:rPr>
+        <w:t>Um Cliente tem várias OrdemServico, pois o mesmo cliente pode solicitar diferentes atendimentos ao longo do tempo. Foi usada uma List porque as ordens formam uma sequência simples e esta etapa ainda não exige chaves nem controle de duplicidade. A coleção é final e inicializada diretamente no atributo. O método adicionarOrdemServico rejeita null antes da inclusão. O diagrama foi atualizado e os quatro testes JUnit passaram.</w:t>
+      </w:r>
+    </w:p>
+    <w:p>
+      <w:pPr>
+        <w:rPr>
+          <w:rFonts w:ascii="Arial" w:hAnsi="Arial" w:cs="Arial"/>
+          <w:b/>
+          <w:sz w:val="22"/>
+        </w:rPr>
+      </w:pPr>
+    </w:p>
+    <w:p>
+      <w:pPr>
+        <w:rPr>
+          <w:rFonts w:ascii="Arial" w:hAnsi="Arial" w:cs="Arial"/>
+          <w:b/>
+          <w:sz w:val="22"/>
+        </w:rPr>
+      </w:pPr>
+      <w:r>
+        <w:rPr>
+          <w:rFonts w:ascii="Arial" w:hAnsi="Arial" w:cs="Arial"/>
+          <w:b/>
           <w:sz w:val="22"/>
         </w:rPr>
         <w:t>Trecho de código:</w:t>
@@ -432,35 +485,40 @@
       <w:pPr>
         <w:rPr>
           <w:rFonts w:ascii="Arial" w:hAnsi="Arial" w:cs="Arial"/>
-          <w:sz w:val="22"/>
-        </w:rPr>
-      </w:pPr>
-      <w:r>
-        <w:rPr>
-          <w:rFonts w:ascii="Arial" w:hAnsi="Arial" w:cs="Arial"/>
-          <w:sz w:val="22"/>
-        </w:rPr>
-        <w:t>private List&lt;OrdemServico&gt; ordensServico;</w:t>
-      </w:r>
-    </w:p>
-    <w:p>
-      <w:pPr>
-        <w:rPr>
-          <w:rFonts w:ascii="Arial" w:hAnsi="Arial" w:cs="Arial"/>
-          <w:sz w:val="22"/>
-        </w:rPr>
-      </w:pPr>
-    </w:p>
-    <w:p>
-      <w:pPr>
-        <w:rPr>
-          <w:rFonts w:ascii="Arial" w:hAnsi="Arial" w:cs="Arial"/>
-          <w:sz w:val="22"/>
-        </w:rPr>
-      </w:pPr>
-      <w:r>
-        <w:rPr>
-          <w:rFonts w:ascii="Arial" w:hAnsi="Arial" w:cs="Arial"/>
+          <w:b/>
+          <w:sz w:val="22"/>
+        </w:rPr>
+      </w:pPr>
+      <w:r>
+        <w:rPr>
+          <w:rFonts w:ascii="Arial" w:hAnsi="Arial" w:cs="Arial"/>
+          <w:b/>
+          <w:sz w:val="22"/>
+        </w:rPr>
+        <w:t>private final List&lt;OrdemServico&gt; ordensServico = new ArrayList&lt;&gt;();</w:t>
+      </w:r>
+    </w:p>
+    <w:p>
+      <w:pPr>
+        <w:rPr>
+          <w:rFonts w:ascii="Arial" w:hAnsi="Arial" w:cs="Arial"/>
+          <w:b/>
+          <w:sz w:val="22"/>
+        </w:rPr>
+      </w:pPr>
+    </w:p>
+    <w:p>
+      <w:pPr>
+        <w:rPr>
+          <w:rFonts w:ascii="Arial" w:hAnsi="Arial" w:cs="Arial"/>
+          <w:b/>
+          <w:sz w:val="22"/>
+        </w:rPr>
+      </w:pPr>
+      <w:r>
+        <w:rPr>
+          <w:rFonts w:ascii="Arial" w:hAnsi="Arial" w:cs="Arial"/>
+          <w:b/>
           <w:sz w:val="22"/>
         </w:rPr>
         <w:t>public void adicionarOrdemServico(OrdemServico ordemServico) {</w:t>
@@ -470,12 +528,74 @@
       <w:pPr>
         <w:rPr>
           <w:rFonts w:ascii="Arial" w:hAnsi="Arial" w:cs="Arial"/>
-          <w:sz w:val="22"/>
-        </w:rPr>
-      </w:pPr>
-      <w:r>
-        <w:rPr>
-          <w:rFonts w:ascii="Arial" w:hAnsi="Arial" w:cs="Arial"/>
+          <w:b/>
+          <w:sz w:val="22"/>
+        </w:rPr>
+      </w:pPr>
+      <w:r>
+        <w:rPr>
+          <w:rFonts w:ascii="Arial" w:hAnsi="Arial" w:cs="Arial"/>
+          <w:b/>
+          <w:sz w:val="22"/>
+        </w:rPr>
+        <w:t xml:space="preserve">    if (ordemServico == null) {</w:t>
+      </w:r>
+    </w:p>
+    <w:p>
+      <w:pPr>
+        <w:rPr>
+          <w:rFonts w:ascii="Arial" w:hAnsi="Arial" w:cs="Arial"/>
+          <w:b/>
+          <w:sz w:val="22"/>
+        </w:rPr>
+      </w:pPr>
+      <w:r>
+        <w:rPr>
+          <w:rFonts w:ascii="Arial" w:hAnsi="Arial" w:cs="Arial"/>
+          <w:b/>
+          <w:sz w:val="22"/>
+        </w:rPr>
+        <w:t xml:space="preserve">        throw new IllegalArgumentException("Ordem de serviço não pode ser nula");</w:t>
+      </w:r>
+    </w:p>
+    <w:p>
+      <w:pPr>
+        <w:rPr>
+          <w:rFonts w:ascii="Arial" w:hAnsi="Arial" w:cs="Arial"/>
+          <w:b/>
+          <w:sz w:val="22"/>
+        </w:rPr>
+      </w:pPr>
+      <w:r>
+        <w:rPr>
+          <w:rFonts w:ascii="Arial" w:hAnsi="Arial" w:cs="Arial"/>
+          <w:b/>
+          <w:sz w:val="22"/>
+        </w:rPr>
+        <w:t xml:space="preserve">    }</w:t>
+      </w:r>
+    </w:p>
+    <w:p>
+      <w:pPr>
+        <w:rPr>
+          <w:rFonts w:ascii="Arial" w:hAnsi="Arial" w:cs="Arial"/>
+          <w:b/>
+          <w:sz w:val="22"/>
+        </w:rPr>
+      </w:pPr>
+    </w:p>
+    <w:p>
+      <w:pPr>
+        <w:rPr>
+          <w:rFonts w:ascii="Arial" w:hAnsi="Arial" w:cs="Arial"/>
+          <w:b/>
+          <w:sz w:val="22"/>
+        </w:rPr>
+      </w:pPr>
+      <w:r>
+        <w:rPr>
+          <w:rFonts w:ascii="Arial" w:hAnsi="Arial" w:cs="Arial"/>
+          <w:b/>
           <w:sz w:val="22"/>
         </w:rPr>
         <w:t xml:space="preserve">    ordensServico.add(ordemServico);</w:t>
@@ -485,12 +605,14 @@
       <w:pPr>
         <w:rPr>
           <w:rFonts w:ascii="Arial" w:hAnsi="Arial" w:cs="Arial"/>
-          <w:sz w:val="22"/>
-        </w:rPr>
-      </w:pPr>
-      <w:r>
-        <w:rPr>
-          <w:rFonts w:ascii="Arial" w:hAnsi="Arial" w:cs="Arial"/>
+          <w:b/>
+          <w:sz w:val="22"/>
+        </w:rPr>
+      </w:pPr>
+      <w:r>
+        <w:rPr>
+          <w:rFonts w:ascii="Arial" w:hAnsi="Arial" w:cs="Arial"/>
+          <w:b/>
           <w:sz w:val="22"/>
         </w:rPr>
         <w:t>}</w:t>
@@ -500,20 +622,23 @@
       <w:pPr>
         <w:rPr>
           <w:rFonts w:ascii="Arial" w:hAnsi="Arial" w:cs="Arial"/>
-          <w:sz w:val="22"/>
-        </w:rPr>
-      </w:pPr>
-    </w:p>
-    <w:p>
-      <w:pPr>
-        <w:rPr>
-          <w:rFonts w:ascii="Arial" w:hAnsi="Arial" w:cs="Arial"/>
-          <w:sz w:val="22"/>
-        </w:rPr>
-      </w:pPr>
-      <w:r>
-        <w:rPr>
-          <w:rFonts w:ascii="Arial" w:hAnsi="Arial" w:cs="Arial"/>
+          <w:b/>
+          <w:sz w:val="22"/>
+        </w:rPr>
+      </w:pPr>
+    </w:p>
+    <w:p>
+      <w:pPr>
+        <w:rPr>
+          <w:rFonts w:ascii="Arial" w:hAnsi="Arial" w:cs="Arial"/>
+          <w:b/>
+          <w:sz w:val="22"/>
+        </w:rPr>
+      </w:pPr>
+      <w:r>
+        <w:rPr>
+          <w:rFonts w:ascii="Arial" w:hAnsi="Arial" w:cs="Arial"/>
+          <w:b/>
           <w:sz w:val="22"/>
         </w:rPr>
         <w:t>6. CHECKLIST DE ITENS ENTREGUES</w:t>
@@ -523,57 +648,116 @@
       <w:pPr>
         <w:rPr>
           <w:rFonts w:ascii="Arial" w:hAnsi="Arial" w:cs="Arial"/>
-          <w:sz w:val="22"/>
-        </w:rPr>
-      </w:pPr>
-      <w:r>
-        <w:rPr>
-          <w:rFonts w:ascii="Arial" w:hAnsi="Arial" w:cs="Arial"/>
-          <w:sz w:val="22"/>
-        </w:rPr>
-        <w:t>[X] Associação um-para-muitos identificada;</w:t>
-      </w:r>
-    </w:p>
-    <w:p>
-      <w:pPr>
-        <w:rPr>
-          <w:rFonts w:ascii="Arial" w:hAnsi="Arial" w:cs="Arial"/>
-          <w:sz w:val="22"/>
-        </w:rPr>
-      </w:pPr>
-      <w:r>
-        <w:rPr>
-          <w:rFonts w:ascii="Arial" w:hAnsi="Arial" w:cs="Arial"/>
-          <w:sz w:val="22"/>
-        </w:rPr>
-        <w:t>[X] Coleção List&lt;OrdemServico&gt; declarada e inicializada;</w:t>
-      </w:r>
-    </w:p>
-    <w:p>
-      <w:pPr>
-        <w:rPr>
-          <w:rFonts w:ascii="Arial" w:hAnsi="Arial" w:cs="Arial"/>
-          <w:sz w:val="22"/>
-        </w:rPr>
-      </w:pPr>
-      <w:r>
-        <w:rPr>
-          <w:rFonts w:ascii="Arial" w:hAnsi="Arial" w:cs="Arial"/>
-          <w:sz w:val="22"/>
-        </w:rPr>
-        <w:t>[X] Método de inclusão funcional;</w:t>
-      </w:r>
-    </w:p>
-    <w:p>
-      <w:pPr>
-        <w:rPr>
-          <w:rFonts w:ascii="Arial" w:hAnsi="Arial" w:cs="Arial"/>
-          <w:sz w:val="22"/>
-        </w:rPr>
-      </w:pPr>
-      <w:r>
-        <w:rPr>
-          <w:rFonts w:ascii="Arial" w:hAnsi="Arial" w:cs="Arial"/>
+          <w:b/>
+          <w:sz w:val="22"/>
+        </w:rPr>
+      </w:pPr>
+      <w:r>
+        <w:rPr>
+          <w:rFonts w:ascii="Arial" w:hAnsi="Arial" w:cs="Arial"/>
+          <w:b/>
+          <w:sz w:val="22"/>
+        </w:rPr>
+        <w:t>[X] Associação um-para-muitos identificada e justificada;</w:t>
+      </w:r>
+    </w:p>
+    <w:p>
+      <w:pPr>
+        <w:rPr>
+          <w:rFonts w:ascii="Arial" w:hAnsi="Arial" w:cs="Arial"/>
+          <w:b/>
+          <w:sz w:val="22"/>
+        </w:rPr>
+      </w:pPr>
+      <w:r>
+        <w:rPr>
+          <w:rFonts w:ascii="Arial" w:hAnsi="Arial" w:cs="Arial"/>
+          <w:b/>
+          <w:sz w:val="22"/>
+        </w:rPr>
+        <w:t>[X] Escolha de List justificada;</w:t>
+      </w:r>
+    </w:p>
+    <w:p>
+      <w:pPr>
+        <w:rPr>
+          <w:rFonts w:ascii="Arial" w:hAnsi="Arial" w:cs="Arial"/>
+          <w:b/>
+          <w:sz w:val="22"/>
+        </w:rPr>
+      </w:pPr>
+      <w:r>
+        <w:rPr>
+          <w:rFonts w:ascii="Arial" w:hAnsi="Arial" w:cs="Arial"/>
+          <w:b/>
+          <w:sz w:val="22"/>
+        </w:rPr>
+        <w:t>[X] Coleção declarada pelo tipo de interface e inicializada no atributo;</w:t>
+      </w:r>
+    </w:p>
+    <w:p>
+      <w:pPr>
+        <w:rPr>
+          <w:rFonts w:ascii="Arial" w:hAnsi="Arial" w:cs="Arial"/>
+          <w:b/>
+          <w:sz w:val="22"/>
+        </w:rPr>
+      </w:pPr>
+      <w:r>
+        <w:rPr>
+          <w:rFonts w:ascii="Arial" w:hAnsi="Arial" w:cs="Arial"/>
+          <w:b/>
+          <w:sz w:val="22"/>
+        </w:rPr>
+        <w:t>[X] Método de inclusão com validação de nulo;</w:t>
+      </w:r>
+    </w:p>
+    <w:p>
+      <w:pPr>
+        <w:rPr>
+          <w:rFonts w:ascii="Arial" w:hAnsi="Arial" w:cs="Arial"/>
+          <w:b/>
+          <w:sz w:val="22"/>
+        </w:rPr>
+      </w:pPr>
+      <w:r>
+        <w:rPr>
+          <w:rFonts w:ascii="Arial" w:hAnsi="Arial" w:cs="Arial"/>
+          <w:b/>
+          <w:sz w:val="22"/>
+        </w:rPr>
+        <w:t>[X] Diagrama de classes atualizado com atributo, método e cardinalidade;</w:t>
+      </w:r>
+    </w:p>
+    <w:p>
+      <w:pPr>
+        <w:rPr>
+          <w:rFonts w:ascii="Arial" w:hAnsi="Arial" w:cs="Arial"/>
+          <w:b/>
+          <w:sz w:val="22"/>
+        </w:rPr>
+      </w:pPr>
+      <w:r>
+        <w:rPr>
+          <w:rFonts w:ascii="Arial" w:hAnsi="Arial" w:cs="Arial"/>
+          <w:b/>
+          <w:sz w:val="22"/>
+        </w:rPr>
+        <w:t>[X] Teste JUnit para rejeição de nulo;</w:t>
+      </w:r>
+    </w:p>
+    <w:p>
+      <w:pPr>
+        <w:rPr>
+          <w:rFonts w:ascii="Arial" w:hAnsi="Arial" w:cs="Arial"/>
+          <w:b/>
+          <w:sz w:val="22"/>
+        </w:rPr>
+      </w:pPr>
+      <w:r>
+        <w:rPr>
+          <w:rFonts w:ascii="Arial" w:hAnsi="Arial" w:cs="Arial"/>
+          <w:b/>
           <w:sz w:val="22"/>
         </w:rPr>
         <w:t>[X] Commit real com o progresso;</w:t>
@@ -583,35 +767,40 @@
       <w:pPr>
         <w:rPr>
           <w:rFonts w:ascii="Arial" w:hAnsi="Arial" w:cs="Arial"/>
-          <w:sz w:val="22"/>
-        </w:rPr>
-      </w:pPr>
-      <w:r>
-        <w:rPr>
-          <w:rFonts w:ascii="Arial" w:hAnsi="Arial" w:cs="Arial"/>
-          <w:sz w:val="22"/>
-        </w:rPr>
-        <w:t>[X] Link do commit e justificativa incluídos nesta ficha.</w:t>
-      </w:r>
-    </w:p>
-    <w:p>
-      <w:pPr>
-        <w:rPr>
-          <w:rFonts w:ascii="Arial" w:hAnsi="Arial" w:cs="Arial"/>
-          <w:sz w:val="22"/>
-        </w:rPr>
-      </w:pPr>
-    </w:p>
-    <w:p>
-      <w:pPr>
-        <w:rPr>
-          <w:rFonts w:ascii="Arial" w:hAnsi="Arial" w:cs="Arial"/>
-          <w:sz w:val="22"/>
-        </w:rPr>
-      </w:pPr>
-      <w:r>
-        <w:rPr>
-          <w:rFonts w:ascii="Arial" w:hAnsi="Arial" w:cs="Arial"/>
+          <w:b/>
+          <w:sz w:val="22"/>
+        </w:rPr>
+      </w:pPr>
+      <w:r>
+        <w:rPr>
+          <w:rFonts w:ascii="Arial" w:hAnsi="Arial" w:cs="Arial"/>
+          <w:b/>
+          <w:sz w:val="22"/>
+        </w:rPr>
+        <w:t>[X] Declaração de uso de IA preenchida.</w:t>
+      </w:r>
+    </w:p>
+    <w:p>
+      <w:pPr>
+        <w:rPr>
+          <w:rFonts w:ascii="Arial" w:hAnsi="Arial" w:cs="Arial"/>
+          <w:b/>
+          <w:sz w:val="22"/>
+        </w:rPr>
+      </w:pPr>
+    </w:p>
+    <w:p>
+      <w:pPr>
+        <w:rPr>
+          <w:rFonts w:ascii="Arial" w:hAnsi="Arial" w:cs="Arial"/>
+          <w:b/>
+          <w:sz w:val="22"/>
+        </w:rPr>
+      </w:pPr>
+      <w:r>
+        <w:rPr>
+          <w:rFonts w:ascii="Arial" w:hAnsi="Arial" w:cs="Arial"/>
+          <w:b/>
           <w:sz w:val="22"/>
         </w:rPr>
         <w:t>Assinaturas: Arthur Scharfenberger e Lucas Oliveira da Silva</w:t>
@@ -627,6 +816,7 @@
       <w:r>
         <w:rPr>
           <w:rFonts w:ascii="Arial" w:hAnsi="Arial" w:cs="Arial"/>
+          <w:b/>
           <w:sz w:val="22"/>
         </w:rPr>
         <w:t>Data: 31/08/2026</w:t>

</xml_diff>